<commit_message>
[MovingControl] Enh || Updated manuals for 4-th lesson
</commit_message>
<xml_diff>
--- a/MovingControl/Методичка 4.docx
+++ b/MovingControl/Методичка 4.docx
@@ -164,12 +164,12 @@
           <wp:inline distB="114300" distT="114300" distL="114300" distR="114300">
             <wp:extent cx="3746663" cy="3739672"/>
             <wp:effectExtent b="0" l="0" r="0" t="0"/>
-            <wp:docPr id="5" name="image1.png"/>
+            <wp:docPr id="9" name="image4.png"/>
             <a:graphic>
               <a:graphicData uri="http://schemas.openxmlformats.org/drawingml/2006/picture">
                 <pic:pic>
                   <pic:nvPicPr>
-                    <pic:cNvPr id="0" name="image1.png"/>
+                    <pic:cNvPr id="0" name="image4.png"/>
                     <pic:cNvPicPr preferRelativeResize="0"/>
                   </pic:nvPicPr>
                   <pic:blipFill>
@@ -330,12 +330,12 @@
           <wp:inline distB="114300" distT="114300" distL="114300" distR="114300">
             <wp:extent cx="5731200" cy="6705600"/>
             <wp:effectExtent b="0" l="0" r="0" t="0"/>
-            <wp:docPr id="1" name="image2.png"/>
+            <wp:docPr id="1" name="image5.png"/>
             <a:graphic>
               <a:graphicData uri="http://schemas.openxmlformats.org/drawingml/2006/picture">
                 <pic:pic>
                   <pic:nvPicPr>
-                    <pic:cNvPr id="0" name="image2.png"/>
+                    <pic:cNvPr id="0" name="image5.png"/>
                     <pic:cNvPicPr preferRelativeResize="0"/>
                   </pic:nvPicPr>
                   <pic:blipFill>
@@ -503,12 +503,12 @@
           <wp:inline distB="114300" distT="114300" distL="114300" distR="114300">
             <wp:extent cx="5731200" cy="4292600"/>
             <wp:effectExtent b="0" l="0" r="0" t="0"/>
-            <wp:docPr id="2" name="image3.png"/>
+            <wp:docPr id="5" name="image6.png"/>
             <a:graphic>
               <a:graphicData uri="http://schemas.openxmlformats.org/drawingml/2006/picture">
                 <pic:pic>
                   <pic:nvPicPr>
-                    <pic:cNvPr id="0" name="image3.png"/>
+                    <pic:cNvPr id="0" name="image6.png"/>
                     <pic:cNvPicPr preferRelativeResize="0"/>
                   </pic:nvPicPr>
                   <pic:blipFill>
@@ -594,12 +594,12 @@
           <wp:inline distB="114300" distT="114300" distL="114300" distR="114300">
             <wp:extent cx="5731200" cy="4292600"/>
             <wp:effectExtent b="0" l="0" r="0" t="0"/>
-            <wp:docPr id="4" name="image5.png"/>
+            <wp:docPr id="8" name="image9.png"/>
             <a:graphic>
               <a:graphicData uri="http://schemas.openxmlformats.org/drawingml/2006/picture">
                 <pic:pic>
                   <pic:nvPicPr>
-                    <pic:cNvPr id="0" name="image5.png"/>
+                    <pic:cNvPr id="0" name="image9.png"/>
                     <pic:cNvPicPr preferRelativeResize="0"/>
                   </pic:nvPicPr>
                   <pic:blipFill>
@@ -1456,12 +1456,12 @@
           <wp:inline distB="114300" distT="114300" distL="114300" distR="114300">
             <wp:extent cx="5731200" cy="1930400"/>
             <wp:effectExtent b="0" l="0" r="0" t="0"/>
-            <wp:docPr id="3" name="image4.png"/>
+            <wp:docPr id="6" name="image1.png"/>
             <a:graphic>
               <a:graphicData uri="http://schemas.openxmlformats.org/drawingml/2006/picture">
                 <pic:pic>
                   <pic:nvPicPr>
-                    <pic:cNvPr id="0" name="image4.png"/>
+                    <pic:cNvPr id="0" name="image1.png"/>
                     <pic:cNvPicPr preferRelativeResize="0"/>
                   </pic:nvPicPr>
                   <pic:blipFill>
@@ -9115,6 +9115,441 @@
         </w:rPr>
         <w:t xml:space="preserve">На этом все, в следующий раз займемся тем, что будем оптимизировать код, чтобы съемка камеры и обработка запросов работало вместе как можно стабильнее.</w:t>
       </w:r>
+    </w:p>
+    <w:p>
+      <w:pPr>
+        <w:ind w:left="0" w:firstLine="0"/>
+        <w:jc w:val="both"/>
+        <w:rPr>
+          <w:rFonts w:ascii="Times New Roman" w:cs="Times New Roman" w:eastAsia="Times New Roman" w:hAnsi="Times New Roman"/>
+          <w:sz w:val="28"/>
+          <w:szCs w:val="28"/>
+        </w:rPr>
+      </w:pPr>
+      <w:r>
+        <w:rPr>
+          <w:rtl w:val="0"/>
+        </w:rPr>
+      </w:r>
+    </w:p>
+    <w:p>
+      <w:pPr>
+        <w:numPr>
+          <w:ilvl w:val="0"/>
+          <w:numId w:val="1"/>
+        </w:numPr>
+        <w:ind w:left="720" w:hanging="360"/>
+        <w:jc w:val="both"/>
+        <w:rPr>
+          <w:rFonts w:ascii="Times New Roman" w:cs="Times New Roman" w:eastAsia="Times New Roman" w:hAnsi="Times New Roman"/>
+          <w:b w:val="1"/>
+          <w:bCs w:val="1"/>
+          <w:sz w:val="28"/>
+          <w:szCs w:val="28"/>
+        </w:rPr>
+      </w:pPr>
+      <w:r>
+        <w:rPr>
+          <w:rFonts w:ascii="Times New Roman" w:cs="Times New Roman" w:eastAsia="Times New Roman" w:hAnsi="Times New Roman"/>
+          <w:b w:val="1"/>
+          <w:bCs w:val="1"/>
+          <w:sz w:val="28"/>
+          <w:szCs w:val="28"/>
+          <w:rtl w:val="0"/>
+        </w:rPr>
+        <w:t xml:space="preserve">Проверка работы</w:t>
+      </w:r>
+    </w:p>
+    <w:p>
+      <w:pPr>
+        <w:ind w:firstLine="720"/>
+        <w:jc w:val="both"/>
+        <w:rPr>
+          <w:rFonts w:ascii="Times New Roman" w:cs="Times New Roman" w:eastAsia="Times New Roman" w:hAnsi="Times New Roman"/>
+          <w:sz w:val="28"/>
+          <w:szCs w:val="28"/>
+        </w:rPr>
+      </w:pPr>
+      <w:r>
+        <w:rPr>
+          <w:rFonts w:ascii="Times New Roman" w:cs="Times New Roman" w:eastAsia="Times New Roman" w:hAnsi="Times New Roman"/>
+          <w:sz w:val="28"/>
+          <w:szCs w:val="28"/>
+          <w:rtl w:val="0"/>
+        </w:rPr>
+        <w:t xml:space="preserve">Чтобы начать работать с кодом, через Web Interface, нужно сначала войти в консоль и вбить команду </w:t>
+      </w:r>
+      <w:r>
+        <w:rPr>
+          <w:rFonts w:ascii="Times New Roman" w:cs="Times New Roman" w:eastAsia="Times New Roman" w:hAnsi="Times New Roman"/>
+          <w:b w:val="1"/>
+          <w:bCs w:val="1"/>
+          <w:sz w:val="28"/>
+          <w:szCs w:val="28"/>
+          <w:rtl w:val="0"/>
+        </w:rPr>
+        <w:t xml:space="preserve">ipconfig</w:t>
+      </w:r>
+      <w:r>
+        <w:rPr>
+          <w:rFonts w:ascii="Times New Roman" w:cs="Times New Roman" w:eastAsia="Times New Roman" w:hAnsi="Times New Roman"/>
+          <w:sz w:val="28"/>
+          <w:szCs w:val="28"/>
+          <w:rtl w:val="0"/>
+        </w:rPr>
+        <w:t xml:space="preserve">.</w:t>
+      </w:r>
+    </w:p>
+    <w:p>
+      <w:pPr>
+        <w:ind w:firstLine="720"/>
+        <w:jc w:val="both"/>
+        <w:rPr>
+          <w:rFonts w:ascii="Times New Roman" w:cs="Times New Roman" w:eastAsia="Times New Roman" w:hAnsi="Times New Roman"/>
+          <w:sz w:val="28"/>
+          <w:szCs w:val="28"/>
+        </w:rPr>
+      </w:pPr>
+      <w:r>
+        <w:rPr>
+          <w:rFonts w:ascii="Times New Roman" w:cs="Times New Roman" w:eastAsia="Times New Roman" w:hAnsi="Times New Roman"/>
+          <w:sz w:val="28"/>
+          <w:szCs w:val="28"/>
+        </w:rPr>
+        <w:drawing>
+          <wp:inline distB="114300" distT="114300" distL="114300" distR="114300">
+            <wp:extent cx="5731200" cy="3429000"/>
+            <wp:effectExtent b="0" l="0" r="0" t="0"/>
+            <wp:docPr id="4" name="image8.png"/>
+            <a:graphic>
+              <a:graphicData uri="http://schemas.openxmlformats.org/drawingml/2006/picture">
+                <pic:pic>
+                  <pic:nvPicPr>
+                    <pic:cNvPr id="0" name="image8.png"/>
+                    <pic:cNvPicPr preferRelativeResize="0"/>
+                  </pic:nvPicPr>
+                  <pic:blipFill>
+                    <a:blip r:embed="rId11"/>
+                    <a:srcRect b="0" l="0" r="0" t="0"/>
+                    <a:stretch>
+                      <a:fillRect/>
+                    </a:stretch>
+                  </pic:blipFill>
+                  <pic:spPr>
+                    <a:xfrm>
+                      <a:off x="0" y="0"/>
+                      <a:ext cx="5731200" cy="3429000"/>
+                    </a:xfrm>
+                    <a:prstGeom prst="rect"/>
+                    <a:ln/>
+                  </pic:spPr>
+                </pic:pic>
+              </a:graphicData>
+            </a:graphic>
+          </wp:inline>
+        </w:drawing>
+      </w:r>
+      <w:r>
+        <w:rPr>
+          <w:rtl w:val="0"/>
+        </w:rPr>
+      </w:r>
+    </w:p>
+    <w:p>
+      <w:pPr>
+        <w:ind w:firstLine="720"/>
+        <w:jc w:val="both"/>
+        <w:rPr>
+          <w:rFonts w:ascii="Times New Roman" w:cs="Times New Roman" w:eastAsia="Times New Roman" w:hAnsi="Times New Roman"/>
+          <w:sz w:val="28"/>
+          <w:szCs w:val="28"/>
+        </w:rPr>
+      </w:pPr>
+      <w:r>
+        <w:rPr>
+          <w:rtl w:val="0"/>
+        </w:rPr>
+      </w:r>
+    </w:p>
+    <w:p>
+      <w:pPr>
+        <w:ind w:left="0" w:firstLine="0"/>
+        <w:jc w:val="both"/>
+        <w:rPr>
+          <w:rFonts w:ascii="Times New Roman" w:cs="Times New Roman" w:eastAsia="Times New Roman" w:hAnsi="Times New Roman"/>
+          <w:sz w:val="28"/>
+          <w:szCs w:val="28"/>
+        </w:rPr>
+      </w:pPr>
+      <w:r>
+        <w:rPr>
+          <w:rFonts w:ascii="Times New Roman" w:cs="Times New Roman" w:eastAsia="Times New Roman" w:hAnsi="Times New Roman"/>
+          <w:sz w:val="28"/>
+          <w:szCs w:val="28"/>
+          <w:rtl w:val="0"/>
+        </w:rPr>
+        <w:t xml:space="preserve">На скриншоте выделен IP, который вы должны вставить в код в выделенную область:</w:t>
+      </w:r>
+    </w:p>
+    <w:p>
+      <w:pPr>
+        <w:ind w:left="0" w:firstLine="720"/>
+        <w:jc w:val="both"/>
+        <w:rPr>
+          <w:rFonts w:ascii="Times New Roman" w:cs="Times New Roman" w:eastAsia="Times New Roman" w:hAnsi="Times New Roman"/>
+          <w:sz w:val="28"/>
+          <w:szCs w:val="28"/>
+        </w:rPr>
+      </w:pPr>
+      <w:r>
+        <w:rPr>
+          <w:rFonts w:ascii="Times New Roman" w:cs="Times New Roman" w:eastAsia="Times New Roman" w:hAnsi="Times New Roman"/>
+          <w:sz w:val="28"/>
+          <w:szCs w:val="28"/>
+        </w:rPr>
+        <w:drawing>
+          <wp:inline distB="114300" distT="114300" distL="114300" distR="114300">
+            <wp:extent cx="5731200" cy="1625600"/>
+            <wp:effectExtent b="0" l="0" r="0" t="0"/>
+            <wp:docPr id="7" name="image2.png"/>
+            <a:graphic>
+              <a:graphicData uri="http://schemas.openxmlformats.org/drawingml/2006/picture">
+                <pic:pic>
+                  <pic:nvPicPr>
+                    <pic:cNvPr id="0" name="image2.png"/>
+                    <pic:cNvPicPr preferRelativeResize="0"/>
+                  </pic:nvPicPr>
+                  <pic:blipFill>
+                    <a:blip r:embed="rId12"/>
+                    <a:srcRect b="0" l="0" r="0" t="0"/>
+                    <a:stretch>
+                      <a:fillRect/>
+                    </a:stretch>
+                  </pic:blipFill>
+                  <pic:spPr>
+                    <a:xfrm>
+                      <a:off x="0" y="0"/>
+                      <a:ext cx="5731200" cy="1625600"/>
+                    </a:xfrm>
+                    <a:prstGeom prst="rect"/>
+                    <a:ln/>
+                  </pic:spPr>
+                </pic:pic>
+              </a:graphicData>
+            </a:graphic>
+          </wp:inline>
+        </w:drawing>
+      </w:r>
+      <w:r>
+        <w:rPr>
+          <w:rtl w:val="0"/>
+        </w:rPr>
+      </w:r>
+    </w:p>
+    <w:p>
+      <w:pPr>
+        <w:ind w:left="0" w:firstLine="0"/>
+        <w:jc w:val="both"/>
+        <w:rPr>
+          <w:rFonts w:ascii="Times New Roman" w:cs="Times New Roman" w:eastAsia="Times New Roman" w:hAnsi="Times New Roman"/>
+          <w:sz w:val="28"/>
+          <w:szCs w:val="28"/>
+        </w:rPr>
+      </w:pPr>
+      <w:r>
+        <w:rPr>
+          <w:rFonts w:ascii="Times New Roman" w:cs="Times New Roman" w:eastAsia="Times New Roman" w:hAnsi="Times New Roman"/>
+          <w:sz w:val="28"/>
+          <w:szCs w:val="28"/>
+          <w:rtl w:val="0"/>
+        </w:rPr>
+        <w:t xml:space="preserve">Потом запустите через консоль python-скрипт </w:t>
+      </w:r>
+      <w:hyperlink r:id="rId13">
+        <w:r>
+          <w:rPr>
+            <w:rFonts w:ascii="Times New Roman" w:cs="Times New Roman" w:eastAsia="Times New Roman" w:hAnsi="Times New Roman"/>
+            <w:b w:val="1"/>
+            <w:bCs w:val="1"/>
+            <w:color w:val="1155cc"/>
+            <w:sz w:val="28"/>
+            <w:szCs w:val="28"/>
+            <w:u w:val="single"/>
+            <w:rtl w:val="0"/>
+          </w:rPr>
+          <w:t xml:space="preserve">serverControl.py</w:t>
+        </w:r>
+      </w:hyperlink>
+      <w:r>
+        <w:rPr>
+          <w:rFonts w:ascii="Times New Roman" w:cs="Times New Roman" w:eastAsia="Times New Roman" w:hAnsi="Times New Roman"/>
+          <w:sz w:val="28"/>
+          <w:szCs w:val="28"/>
+          <w:rtl w:val="0"/>
+        </w:rPr>
+        <w:t xml:space="preserve">. У вас появится следующий текст в консоли:</w:t>
+      </w:r>
+    </w:p>
+    <w:p>
+      <w:pPr>
+        <w:ind w:left="0" w:firstLine="720"/>
+        <w:jc w:val="both"/>
+        <w:rPr>
+          <w:rFonts w:ascii="Times New Roman" w:cs="Times New Roman" w:eastAsia="Times New Roman" w:hAnsi="Times New Roman"/>
+          <w:sz w:val="28"/>
+          <w:szCs w:val="28"/>
+        </w:rPr>
+      </w:pPr>
+      <w:r>
+        <w:rPr>
+          <w:rFonts w:ascii="Times New Roman" w:cs="Times New Roman" w:eastAsia="Times New Roman" w:hAnsi="Times New Roman"/>
+          <w:sz w:val="28"/>
+          <w:szCs w:val="28"/>
+        </w:rPr>
+        <w:drawing>
+          <wp:inline distB="114300" distT="114300" distL="114300" distR="114300">
+            <wp:extent cx="5731200" cy="3187700"/>
+            <wp:effectExtent b="0" l="0" r="0" t="0"/>
+            <wp:docPr id="2" name="image7.png"/>
+            <a:graphic>
+              <a:graphicData uri="http://schemas.openxmlformats.org/drawingml/2006/picture">
+                <pic:pic>
+                  <pic:nvPicPr>
+                    <pic:cNvPr id="0" name="image7.png"/>
+                    <pic:cNvPicPr preferRelativeResize="0"/>
+                  </pic:nvPicPr>
+                  <pic:blipFill>
+                    <a:blip r:embed="rId14"/>
+                    <a:srcRect b="0" l="0" r="0" t="0"/>
+                    <a:stretch>
+                      <a:fillRect/>
+                    </a:stretch>
+                  </pic:blipFill>
+                  <pic:spPr>
+                    <a:xfrm>
+                      <a:off x="0" y="0"/>
+                      <a:ext cx="5731200" cy="3187700"/>
+                    </a:xfrm>
+                    <a:prstGeom prst="rect"/>
+                    <a:ln/>
+                  </pic:spPr>
+                </pic:pic>
+              </a:graphicData>
+            </a:graphic>
+          </wp:inline>
+        </w:drawing>
+      </w:r>
+      <w:r>
+        <w:rPr>
+          <w:rtl w:val="0"/>
+        </w:rPr>
+      </w:r>
+    </w:p>
+    <w:p>
+      <w:pPr>
+        <w:ind w:left="0" w:firstLine="0"/>
+        <w:jc w:val="both"/>
+        <w:rPr>
+          <w:rFonts w:ascii="Times New Roman" w:cs="Times New Roman" w:eastAsia="Times New Roman" w:hAnsi="Times New Roman"/>
+          <w:sz w:val="28"/>
+          <w:szCs w:val="28"/>
+        </w:rPr>
+      </w:pPr>
+      <w:r>
+        <w:rPr>
+          <w:rFonts w:ascii="Times New Roman" w:cs="Times New Roman" w:eastAsia="Times New Roman" w:hAnsi="Times New Roman"/>
+          <w:sz w:val="28"/>
+          <w:szCs w:val="28"/>
+          <w:rtl w:val="0"/>
+        </w:rPr>
+        <w:t xml:space="preserve">Выделенный текст - это ссылка на сайт, который реализует управление машинкой через элементы управления.</w:t>
+      </w:r>
+    </w:p>
+    <w:p>
+      <w:pPr>
+        <w:ind w:left="0" w:firstLine="720"/>
+        <w:jc w:val="both"/>
+        <w:rPr>
+          <w:rFonts w:ascii="Times New Roman" w:cs="Times New Roman" w:eastAsia="Times New Roman" w:hAnsi="Times New Roman"/>
+          <w:sz w:val="28"/>
+          <w:szCs w:val="28"/>
+        </w:rPr>
+      </w:pPr>
+      <w:r>
+        <w:rPr>
+          <w:rFonts w:ascii="Times New Roman" w:cs="Times New Roman" w:eastAsia="Times New Roman" w:hAnsi="Times New Roman"/>
+          <w:sz w:val="28"/>
+          <w:szCs w:val="28"/>
+        </w:rPr>
+        <w:drawing>
+          <wp:inline distB="114300" distT="114300" distL="114300" distR="114300">
+            <wp:extent cx="5731200" cy="3390900"/>
+            <wp:effectExtent b="0" l="0" r="0" t="0"/>
+            <wp:docPr id="3" name="image3.png"/>
+            <a:graphic>
+              <a:graphicData uri="http://schemas.openxmlformats.org/drawingml/2006/picture">
+                <pic:pic>
+                  <pic:nvPicPr>
+                    <pic:cNvPr id="0" name="image3.png"/>
+                    <pic:cNvPicPr preferRelativeResize="0"/>
+                  </pic:nvPicPr>
+                  <pic:blipFill>
+                    <a:blip r:embed="rId15"/>
+                    <a:srcRect b="0" l="0" r="0" t="0"/>
+                    <a:stretch>
+                      <a:fillRect/>
+                    </a:stretch>
+                  </pic:blipFill>
+                  <pic:spPr>
+                    <a:xfrm>
+                      <a:off x="0" y="0"/>
+                      <a:ext cx="5731200" cy="3390900"/>
+                    </a:xfrm>
+                    <a:prstGeom prst="rect"/>
+                    <a:ln/>
+                  </pic:spPr>
+                </pic:pic>
+              </a:graphicData>
+            </a:graphic>
+          </wp:inline>
+        </w:drawing>
+      </w:r>
+      <w:r>
+        <w:rPr>
+          <w:rtl w:val="0"/>
+        </w:rPr>
+      </w:r>
+    </w:p>
+    <w:p>
+      <w:pPr>
+        <w:ind w:left="0" w:firstLine="0"/>
+        <w:jc w:val="both"/>
+        <w:rPr>
+          <w:rFonts w:ascii="Times New Roman" w:cs="Times New Roman" w:eastAsia="Times New Roman" w:hAnsi="Times New Roman"/>
+          <w:sz w:val="28"/>
+          <w:szCs w:val="28"/>
+        </w:rPr>
+      </w:pPr>
+      <w:r>
+        <w:rPr>
+          <w:rFonts w:ascii="Times New Roman" w:cs="Times New Roman" w:eastAsia="Times New Roman" w:hAnsi="Times New Roman"/>
+          <w:sz w:val="28"/>
+          <w:szCs w:val="28"/>
+          <w:rtl w:val="0"/>
+        </w:rPr>
+        <w:t xml:space="preserve">Через “стрелочки” на сайте или клавиатуры можете управлять движением машинки.</w:t>
+      </w:r>
+    </w:p>
+    <w:p>
+      <w:pPr>
+        <w:ind w:left="0" w:firstLine="0"/>
+        <w:jc w:val="both"/>
+        <w:rPr>
+          <w:rFonts w:ascii="Times New Roman" w:cs="Times New Roman" w:eastAsia="Times New Roman" w:hAnsi="Times New Roman"/>
+          <w:sz w:val="28"/>
+          <w:szCs w:val="28"/>
+        </w:rPr>
+      </w:pPr>
       <w:r>
         <w:rPr>
           <w:rtl w:val="0"/>

</xml_diff>